<commit_message>
fix: remove const DB_NAME de db.js e bump cache SW v3
- db.js agora é um arquivo vazio/comentado para evitar conflito
  'Identifier DB_NAME has already been declared' com app.js
- Cache do Service Worker bumpado para v3 para forçar
  substituição do db.js antigo em cache
</commit_message>
<xml_diff>
--- a/requisitos/Requisitos_Aplicativo_Grandes_Eventos.docx
+++ b/requisitos/Requisitos_Aplicativo_Grandes_Eventos.docx
@@ -63,6 +63,50 @@
     <w:p>
       <w:pPr>
         <w:pStyle w:val="Commarcadores"/>
+        <w:rPr>
+          <w:color w:val="FF0000"/>
+        </w:rPr>
+      </w:pPr>
+      <w:r>
+        <w:rPr>
+          <w:color w:val="FF0000"/>
+        </w:rPr>
+        <w:t>Prioridade teste de etiquetagem</w:t>
+      </w:r>
+    </w:p>
+    <w:p>
+      <w:pPr>
+        <w:pStyle w:val="Commarcadores"/>
+        <w:rPr>
+          <w:color w:val="FF0000"/>
+        </w:rPr>
+      </w:pPr>
+      <w:r>
+        <w:rPr>
+          <w:color w:val="FF0000"/>
+        </w:rPr>
+        <w:t xml:space="preserve">Migrar para banco de dados </w:t>
+      </w:r>
+      <w:proofErr w:type="spellStart"/>
+      <w:proofErr w:type="gramStart"/>
+      <w:r>
+        <w:rPr>
+          <w:color w:val="FF0000"/>
+        </w:rPr>
+        <w:t>Postgres</w:t>
+      </w:r>
+      <w:proofErr w:type="spellEnd"/>
+      <w:r>
+        <w:rPr>
+          <w:color w:val="FF0000"/>
+        </w:rPr>
+        <w:t xml:space="preserve"> ?</w:t>
+      </w:r>
+      <w:proofErr w:type="gramEnd"/>
+    </w:p>
+    <w:p>
+      <w:pPr>
+        <w:pStyle w:val="Commarcadores"/>
       </w:pPr>
       <w:r>
         <w:t>Inserir maior controle sobre monitoração e controle do espectro.</w:t>
@@ -230,6 +274,7 @@
         <w:pStyle w:val="Commarcadores"/>
       </w:pPr>
       <w:r>
+        <w:lastRenderedPageBreak/>
         <w:t>Consulta de produtos homologados</w:t>
       </w:r>
     </w:p>
@@ -238,7 +283,6 @@
         <w:pStyle w:val="Ttulo2"/>
       </w:pPr>
       <w:r>
-        <w:lastRenderedPageBreak/>
         <w:t>Fluxo Operacional</w:t>
       </w:r>
     </w:p>
@@ -369,6 +413,26 @@
 <file path=word/numbering.xml><?xml version="1.0" encoding="utf-8"?>
 <w:numbering xmlns:wpc="http://schemas.microsoft.com/office/word/2010/wordprocessingCanvas" xmlns:cx="http://schemas.microsoft.com/office/drawing/2014/chartex" xmlns:cx1="http://schemas.microsoft.com/office/drawing/2015/9/8/chartex" xmlns:cx2="http://schemas.microsoft.com/office/drawing/2015/10/21/chartex" xmlns:cx3="http://schemas.microsoft.com/office/drawing/2016/5/9/chartex" xmlns:cx4="http://schemas.microsoft.com/office/drawing/2016/5/10/chartex" xmlns:cx5="http://schemas.microsoft.com/office/drawing/2016/5/11/chartex" xmlns:cx6="http://schemas.microsoft.com/office/drawing/2016/5/12/chartex" xmlns:cx7="http://schemas.microsoft.com/office/drawing/2016/5/13/chartex" xmlns:cx8="http://schemas.microsoft.com/office/drawing/2016/5/14/chartex" xmlns:mc="http://schemas.openxmlformats.org/markup-compatibility/2006" xmlns:aink="http://schemas.microsoft.com/office/drawing/2016/ink" xmlns:am3d="http://schemas.microsoft.com/office/drawing/2017/model3d" xmlns:o="urn:schemas-microsoft-com:office:office" xmlns:oel="http://schemas.microsoft.com/office/2019/extlst" xmlns:r="http://schemas.openxmlformats.org/officeDocument/2006/relationships" xmlns:m="http://schemas.openxmlformats.org/officeDocument/2006/math" xmlns:v="urn:schemas-microsoft-com:vml" xmlns:wp14="http://schemas.microsoft.com/office/word/2010/wordprocessingDrawing" xmlns:wp="http://schemas.openxmlformats.org/drawingml/2006/wordprocessingDrawing" xmlns:w10="urn:schemas-microsoft-com:office:word" xmlns:w="http://schemas.openxmlformats.org/wordprocessingml/2006/main" xmlns:w14="http://schemas.microsoft.com/office/word/2010/wordml" xmlns:w15="http://schemas.microsoft.com/office/word/2012/wordml" xmlns:w16cex="http://schemas.microsoft.com/office/word/2018/wordml/cex" xmlns:w16cid="http://schemas.microsoft.com/office/word/2016/wordml/cid" xmlns:w16="http://schemas.microsoft.com/office/word/2018/wordml" xmlns:w16du="http://schemas.microsoft.com/office/word/2023/wordml/word16du" xmlns:w16sdtdh="http://schemas.microsoft.com/office/word/2020/wordml/sdtdatahash" xmlns:w16sdtfl="http://schemas.microsoft.com/office/word/2024/wordml/sdtformatlock" xmlns:w16se="http://schemas.microsoft.com/office/word/2015/wordml/symex" xmlns:wpg="http://schemas.microsoft.com/office/word/2010/wordprocessingGroup" xmlns:wpi="http://schemas.microsoft.com/office/word/2010/wordprocessingInk" xmlns:wne="http://schemas.microsoft.com/office/word/2006/wordml" xmlns:wps="http://schemas.microsoft.com/office/word/2010/wordprocessingShape" mc:Ignorable="w14 w15 w16se w16cid w16 w16cex w16sdtdh w16sdtfl w16du wp14">
   <w:abstractNum w:abstractNumId="0" w15:restartNumberingAfterBreak="0">
+    <w:nsid w:val="FFFFFF89"/>
+    <w:multiLevelType w:val="singleLevel"/>
+    <w:tmpl w:val="88A0E76E"/>
+    <w:lvl w:ilvl="0">
+      <w:start w:val="1"/>
+      <w:numFmt w:val="bullet"/>
+      <w:lvlText w:val=""/>
+      <w:lvlJc w:val="left"/>
+      <w:pPr>
+        <w:tabs>
+          <w:tab w:val="num" w:pos="360"/>
+        </w:tabs>
+        <w:ind w:left="360" w:hanging="360"/>
+      </w:pPr>
+      <w:rPr>
+        <w:rFonts w:ascii="Symbol" w:hAnsi="Symbol" w:hint="default"/>
+      </w:rPr>
+    </w:lvl>
+  </w:abstractNum>
+  <w:abstractNum w:abstractNumId="1" w15:restartNumberingAfterBreak="0">
     <w:nsid w:val="16557B36"/>
     <w:multiLevelType w:val="multilevel"/>
     <w:tmpl w:val="4D984AF6"/>
@@ -482,7 +546,7 @@
       </w:pPr>
     </w:lvl>
   </w:abstractNum>
-  <w:abstractNum w:abstractNumId="1" w15:restartNumberingAfterBreak="0">
+  <w:abstractNum w:abstractNumId="2" w15:restartNumberingAfterBreak="0">
     <w:nsid w:val="1C81462F"/>
     <w:multiLevelType w:val="multilevel"/>
     <w:tmpl w:val="5D34110E"/>
@@ -596,7 +660,7 @@
       </w:pPr>
     </w:lvl>
   </w:abstractNum>
-  <w:abstractNum w:abstractNumId="2" w15:restartNumberingAfterBreak="0">
+  <w:abstractNum w:abstractNumId="3" w15:restartNumberingAfterBreak="0">
     <w:nsid w:val="1C826402"/>
     <w:multiLevelType w:val="multilevel"/>
     <w:tmpl w:val="C62E7BD8"/>
@@ -718,7 +782,7 @@
       </w:pPr>
     </w:lvl>
   </w:abstractNum>
-  <w:abstractNum w:abstractNumId="3" w15:restartNumberingAfterBreak="0">
+  <w:abstractNum w:abstractNumId="4" w15:restartNumberingAfterBreak="0">
     <w:nsid w:val="22803C83"/>
     <w:multiLevelType w:val="multilevel"/>
     <w:tmpl w:val="04CEAA54"/>
@@ -835,7 +899,7 @@
       </w:pPr>
     </w:lvl>
   </w:abstractNum>
-  <w:abstractNum w:abstractNumId="4" w15:restartNumberingAfterBreak="0">
+  <w:abstractNum w:abstractNumId="5" w15:restartNumberingAfterBreak="0">
     <w:nsid w:val="59D7621B"/>
     <w:multiLevelType w:val="multilevel"/>
     <w:tmpl w:val="F33E17AE"/>
@@ -952,7 +1016,7 @@
       </w:pPr>
     </w:lvl>
   </w:abstractNum>
-  <w:abstractNum w:abstractNumId="5" w15:restartNumberingAfterBreak="0">
+  <w:abstractNum w:abstractNumId="6" w15:restartNumberingAfterBreak="0">
     <w:nsid w:val="5C2C5F57"/>
     <w:multiLevelType w:val="multilevel"/>
     <w:tmpl w:val="BEFA0A74"/>
@@ -1069,7 +1133,7 @@
       </w:pPr>
     </w:lvl>
   </w:abstractNum>
-  <w:abstractNum w:abstractNumId="6" w15:restartNumberingAfterBreak="0">
+  <w:abstractNum w:abstractNumId="7" w15:restartNumberingAfterBreak="0">
     <w:nsid w:val="774F6E67"/>
     <w:multiLevelType w:val="multilevel"/>
     <w:tmpl w:val="570CCD3C"/>
@@ -1184,25 +1248,28 @@
     </w:lvl>
   </w:abstractNum>
   <w:num w:numId="1" w16cid:durableId="29378908">
+    <w:abstractNumId w:val="4"/>
+  </w:num>
+  <w:num w:numId="2" w16cid:durableId="1993682195">
+    <w:abstractNumId w:val="5"/>
+  </w:num>
+  <w:num w:numId="3" w16cid:durableId="1124352665">
+    <w:abstractNumId w:val="6"/>
+  </w:num>
+  <w:num w:numId="4" w16cid:durableId="1940259506">
+    <w:abstractNumId w:val="1"/>
+  </w:num>
+  <w:num w:numId="5" w16cid:durableId="285552323">
+    <w:abstractNumId w:val="2"/>
+  </w:num>
+  <w:num w:numId="6" w16cid:durableId="412356446">
+    <w:abstractNumId w:val="7"/>
+  </w:num>
+  <w:num w:numId="7" w16cid:durableId="467091565">
     <w:abstractNumId w:val="3"/>
   </w:num>
-  <w:num w:numId="2" w16cid:durableId="1993682195">
-    <w:abstractNumId w:val="4"/>
-  </w:num>
-  <w:num w:numId="3" w16cid:durableId="1124352665">
-    <w:abstractNumId w:val="5"/>
-  </w:num>
-  <w:num w:numId="4" w16cid:durableId="1940259506">
+  <w:num w:numId="8" w16cid:durableId="390814514">
     <w:abstractNumId w:val="0"/>
-  </w:num>
-  <w:num w:numId="5" w16cid:durableId="285552323">
-    <w:abstractNumId w:val="1"/>
-  </w:num>
-  <w:num w:numId="6" w16cid:durableId="412356446">
-    <w:abstractNumId w:val="6"/>
-  </w:num>
-  <w:num w:numId="7" w16cid:durableId="467091565">
-    <w:abstractNumId w:val="2"/>
   </w:num>
 </w:numbering>
 </file>

</xml_diff>